<commit_message>
updated infoproject BS - Project Draft
</commit_message>
<xml_diff>
--- a/Project_Drafts/Project_Draft_BSc_Seminar.docx
+++ b/Project_Drafts/Project_Draft_BSc_Seminar.docx
@@ -234,21 +234,8 @@
                 <w:szCs w:val="22"/>
                 <w:lang w:val="en-US"/>
               </w:rPr>
-              <w:t xml:space="preserve">Paper </w:t>
-            </w:r>
-            <w:proofErr w:type="gramStart"/>
-            <w:r>
-              <w:rPr>
-                <w:rFonts w:ascii="Calibri" w:eastAsia="Calibri" w:hAnsi="Calibri" w:cs="Calibri"/>
-                <w:b/>
-                <w:bCs/>
-                <w:sz w:val="22"/>
-                <w:szCs w:val="22"/>
-                <w:lang w:val="en-US"/>
-              </w:rPr>
-              <w:t>brief summary</w:t>
-            </w:r>
-            <w:proofErr w:type="gramEnd"/>
+              <w:t>Paper brief summary</w:t>
+            </w:r>
           </w:p>
           <w:p>
             <w:pPr>
@@ -452,6 +439,11 @@
             </w:r>
           </w:p>
           <w:p>
+            <w:pPr>
+              <w:rPr>
+                <w:lang w:val="en-US"/>
+              </w:rPr>
+            </w:pPr>
             <w:r>
               <w:rPr>
                 <w:rFonts w:ascii="Calibri" w:eastAsia="Calibri" w:hAnsi="Calibri" w:cs="Calibri"/>
@@ -479,40 +471,14 @@
               </w:rPr>
               <w:t xml:space="preserve"> that could explain this policy question? </w:t>
             </w:r>
-            <w:r>
-              <w:rPr>
-                <w:rFonts w:ascii="Calibri" w:eastAsia="Calibri" w:hAnsi="Calibri" w:cs="Calibri"/>
-                <w:sz w:val="22"/>
-                <w:szCs w:val="22"/>
-                <w:lang w:val="en-US"/>
-              </w:rPr>
-              <w:t xml:space="preserve">(Not mandatory </w:t>
-            </w:r>
-            <w:r>
-              <w:rPr>
-                <w:rFonts w:ascii="Calibri" w:eastAsia="Calibri" w:hAnsi="Calibri" w:cs="Calibri"/>
-                <w:sz w:val="22"/>
-                <w:szCs w:val="22"/>
-                <w:lang w:val="en-US"/>
-              </w:rPr>
-              <w:t>but insightful</w:t>
-            </w:r>
-            <w:r>
-              <w:rPr>
-                <w:rFonts w:ascii="Calibri" w:eastAsia="Calibri" w:hAnsi="Calibri" w:cs="Calibri"/>
-                <w:sz w:val="22"/>
-                <w:szCs w:val="22"/>
-                <w:lang w:val="en-US"/>
-              </w:rPr>
-              <w:t>)</w:t>
-            </w:r>
-          </w:p>
-          <w:p>
-            <w:pPr>
-              <w:rPr>
-                <w:rFonts w:ascii="Calibri" w:eastAsia="Calibri" w:hAnsi="Calibri" w:cs="Calibri"/>
-                <w:sz w:val="22"/>
-                <w:szCs w:val="22"/>
+          </w:p>
+          <w:p>
+            <w:pPr>
+              <w:rPr>
+                <w:rFonts w:ascii="Calibri" w:eastAsia="Calibri" w:hAnsi="Calibri" w:cs="Calibri"/>
+                <w:sz w:val="22"/>
+                <w:szCs w:val="22"/>
+                <w:lang w:val="en-US"/>
               </w:rPr>
             </w:pPr>
           </w:p>
@@ -531,6 +497,7 @@
                 <w:rFonts w:ascii="Calibri" w:eastAsia="Calibri" w:hAnsi="Calibri" w:cs="Calibri"/>
                 <w:sz w:val="22"/>
                 <w:szCs w:val="22"/>
+                <w:lang w:val="en-US"/>
               </w:rPr>
             </w:pPr>
           </w:p>
@@ -1346,6 +1313,7 @@
   <w:style w:type="character" w:default="1" w:styleId="Absatz-Standardschriftart">
     <w:name w:val="Default Paragraph Font"/>
     <w:uiPriority w:val="1"/>
+    <w:semiHidden/>
     <w:unhideWhenUsed/>
   </w:style>
   <w:style w:type="table" w:default="1" w:styleId="NormaleTabelle">
@@ -1676,6 +1644,12 @@
 </file>
 
 <file path=customXml/item1.xml><?xml version="1.0" encoding="utf-8"?>
+<p:properties xmlns:p="http://schemas.microsoft.com/office/2006/metadata/properties" xmlns:xsi="http://www.w3.org/2001/XMLSchema-instance" xmlns:pc="http://schemas.microsoft.com/office/infopath/2007/PartnerControls">
+  <documentManagement/>
+</p:properties>
+</file>
+
+<file path=customXml/item2.xml><?xml version="1.0" encoding="utf-8"?>
 <ct:contentTypeSchema xmlns:ct="http://schemas.microsoft.com/office/2006/metadata/contentType" xmlns:ma="http://schemas.microsoft.com/office/2006/metadata/properties/metaAttributes" ct:_="" ma:_="" ma:contentTypeName="Dokument" ma:contentTypeID="0x01010082BA5C279903894DA777E5C36F860EFD" ma:contentTypeVersion="3" ma:contentTypeDescription="Ein neues Dokument erstellen." ma:contentTypeScope="" ma:versionID="704cd79292e6c0e728fd79ff16b1f141">
   <xsd:schema xmlns:xsd="http://www.w3.org/2001/XMLSchema" xmlns:xs="http://www.w3.org/2001/XMLSchema" xmlns:p="http://schemas.microsoft.com/office/2006/metadata/properties" xmlns:ns2="4938f991-2b30-4e51-84ba-e9c517293fca" targetNamespace="http://schemas.microsoft.com/office/2006/metadata/properties" ma:root="true" ma:fieldsID="bd5b437fe9fd6de4875bc5d7656127da" ns2:_="">
     <xsd:import namespace="4938f991-2b30-4e51-84ba-e9c517293fca"/>
@@ -1813,12 +1787,6 @@
 </ct:contentTypeSchema>
 </file>
 
-<file path=customXml/item2.xml><?xml version="1.0" encoding="utf-8"?>
-<p:properties xmlns:p="http://schemas.microsoft.com/office/2006/metadata/properties" xmlns:xsi="http://www.w3.org/2001/XMLSchema-instance" xmlns:pc="http://schemas.microsoft.com/office/infopath/2007/PartnerControls">
-  <documentManagement/>
-</p:properties>
-</file>
-
 <file path=customXml/item3.xml><?xml version="1.0" encoding="utf-8"?>
 <?mso-contentType ?>
 <FormTemplates xmlns="http://schemas.microsoft.com/sharepoint/v3/contenttype/forms">
@@ -1829,6 +1797,15 @@
 </file>
 
 <file path=customXml/itemProps1.xml><?xml version="1.0" encoding="utf-8"?>
+<ds:datastoreItem xmlns:ds="http://schemas.openxmlformats.org/officeDocument/2006/customXml" ds:itemID="{647435F1-E54E-4A0C-9C41-91370FAC798B}">
+  <ds:schemaRefs>
+    <ds:schemaRef ds:uri="http://schemas.microsoft.com/office/2006/metadata/properties"/>
+    <ds:schemaRef ds:uri="http://schemas.microsoft.com/office/infopath/2007/PartnerControls"/>
+  </ds:schemaRefs>
+</ds:datastoreItem>
+</file>
+
+<file path=customXml/itemProps2.xml><?xml version="1.0" encoding="utf-8"?>
 <ds:datastoreItem xmlns:ds="http://schemas.openxmlformats.org/officeDocument/2006/customXml" ds:itemID="{5BF70213-61CC-4CD5-B740-8995BEC1F7C8}">
   <ds:schemaRefs>
     <ds:schemaRef ds:uri="http://schemas.microsoft.com/office/2006/metadata/contentType"/>
@@ -1846,15 +1823,6 @@
 </ds:datastoreItem>
 </file>
 
-<file path=customXml/itemProps2.xml><?xml version="1.0" encoding="utf-8"?>
-<ds:datastoreItem xmlns:ds="http://schemas.openxmlformats.org/officeDocument/2006/customXml" ds:itemID="{647435F1-E54E-4A0C-9C41-91370FAC798B}">
-  <ds:schemaRefs>
-    <ds:schemaRef ds:uri="http://schemas.microsoft.com/office/2006/metadata/properties"/>
-    <ds:schemaRef ds:uri="http://schemas.microsoft.com/office/infopath/2007/PartnerControls"/>
-  </ds:schemaRefs>
-</ds:datastoreItem>
-</file>
-
 <file path=customXml/itemProps3.xml><?xml version="1.0" encoding="utf-8"?>
 <ds:datastoreItem xmlns:ds="http://schemas.openxmlformats.org/officeDocument/2006/customXml" ds:itemID="{E253793E-741A-4B66-B5E9-2341CBBBC915}">
   <ds:schemaRefs>

</xml_diff>